<commit_message>
breaking ground on week 11
</commit_message>
<xml_diff>
--- a/syllabus/syllabusSp26.docx
+++ b/syllabus/syllabusSp26.docx
@@ -2638,27 +2638,7 @@
                 <w:sz w:val="20"/>
                 <w:szCs w:val="20"/>
               </w:rPr>
-              <w:t xml:space="preserve">orkshop: </w:t>
-            </w:r>
-            <w:proofErr w:type="spellStart"/>
-            <w:r>
-              <w:rPr>
-                <w:rFonts w:eastAsia="Times New Roman"/>
-                <w:color w:val="000000"/>
-                <w:sz w:val="20"/>
-                <w:szCs w:val="20"/>
-              </w:rPr>
-              <w:t>Datawrapper</w:t>
-            </w:r>
-            <w:proofErr w:type="spellEnd"/>
-            <w:r>
-              <w:rPr>
-                <w:rFonts w:eastAsia="Times New Roman"/>
-                <w:color w:val="000000"/>
-                <w:sz w:val="20"/>
-                <w:szCs w:val="20"/>
-              </w:rPr>
-              <w:t xml:space="preserve"> pt. 1</w:t>
+              <w:t>orkshop: Datawrapper pt. 1</w:t>
             </w:r>
           </w:p>
         </w:tc>
@@ -2913,27 +2893,7 @@
                 <w:sz w:val="20"/>
                 <w:szCs w:val="20"/>
               </w:rPr>
-              <w:t xml:space="preserve">Workshop: </w:t>
-            </w:r>
-            <w:proofErr w:type="spellStart"/>
-            <w:r>
-              <w:rPr>
-                <w:rFonts w:eastAsia="Times New Roman"/>
-                <w:color w:val="000000"/>
-                <w:sz w:val="20"/>
-                <w:szCs w:val="20"/>
-              </w:rPr>
-              <w:t>Datawrapper</w:t>
-            </w:r>
-            <w:proofErr w:type="spellEnd"/>
-            <w:r>
-              <w:rPr>
-                <w:rFonts w:eastAsia="Times New Roman"/>
-                <w:color w:val="000000"/>
-                <w:sz w:val="20"/>
-                <w:szCs w:val="20"/>
-              </w:rPr>
-              <w:t xml:space="preserve"> pt 2</w:t>
+              <w:t>Workshop: Datawrapper pt 2</w:t>
             </w:r>
           </w:p>
         </w:tc>
@@ -3148,19 +3108,8 @@
                 <w:sz w:val="20"/>
                 <w:szCs w:val="20"/>
               </w:rPr>
-              <w:t xml:space="preserve">Workshop: Tech check – Google </w:t>
-            </w:r>
-            <w:proofErr w:type="spellStart"/>
-            <w:r>
-              <w:rPr>
-                <w:rFonts w:eastAsia="Times New Roman"/>
-                <w:color w:val="000000"/>
-                <w:sz w:val="20"/>
-                <w:szCs w:val="20"/>
-              </w:rPr>
-              <w:t>Colab</w:t>
-            </w:r>
-            <w:proofErr w:type="spellEnd"/>
+              <w:t>Workshop: Tech check – Google Colab</w:t>
+            </w:r>
           </w:p>
         </w:tc>
         <w:tc>
@@ -3726,39 +3675,8 @@
                 <w:sz w:val="20"/>
                 <w:szCs w:val="20"/>
               </w:rPr>
-              <w:t xml:space="preserve">Workshop: Seaborn, </w:t>
-            </w:r>
-            <w:proofErr w:type="spellStart"/>
-            <w:r>
-              <w:rPr>
-                <w:rFonts w:eastAsia="Times New Roman"/>
-                <w:color w:val="000000"/>
-                <w:sz w:val="20"/>
-                <w:szCs w:val="20"/>
-              </w:rPr>
-              <w:t>MatplotLib</w:t>
-            </w:r>
-            <w:proofErr w:type="spellEnd"/>
-            <w:r>
-              <w:rPr>
-                <w:rFonts w:eastAsia="Times New Roman"/>
-                <w:color w:val="000000"/>
-                <w:sz w:val="20"/>
-                <w:szCs w:val="20"/>
-              </w:rPr>
-              <w:t xml:space="preserve">, </w:t>
-            </w:r>
-            <w:proofErr w:type="spellStart"/>
-            <w:r>
-              <w:rPr>
-                <w:rFonts w:eastAsia="Times New Roman"/>
-                <w:color w:val="000000"/>
-                <w:sz w:val="20"/>
-                <w:szCs w:val="20"/>
-              </w:rPr>
-              <w:t>Scipy</w:t>
-            </w:r>
-            <w:proofErr w:type="spellEnd"/>
+              <w:t>Workshop: Seaborn, MatplotLib, Scipy</w:t>
+            </w:r>
           </w:p>
         </w:tc>
         <w:tc>
@@ -3801,7 +3719,7 @@
                 <w:sz w:val="20"/>
                 <w:szCs w:val="20"/>
               </w:rPr>
-              <w:t>Ch 16 and 21</w:t>
+              <w:t>Ch 16</w:t>
             </w:r>
           </w:p>
         </w:tc>
@@ -4127,27 +4045,7 @@
                 <w:sz w:val="20"/>
                 <w:szCs w:val="20"/>
               </w:rPr>
-              <w:t xml:space="preserve">Workshop: </w:t>
-            </w:r>
-            <w:proofErr w:type="spellStart"/>
-            <w:r>
-              <w:rPr>
-                <w:rFonts w:eastAsia="Times New Roman"/>
-                <w:color w:val="000000"/>
-                <w:sz w:val="20"/>
-                <w:szCs w:val="20"/>
-              </w:rPr>
-              <w:t>Plotly</w:t>
-            </w:r>
-            <w:proofErr w:type="spellEnd"/>
-            <w:r>
-              <w:rPr>
-                <w:rFonts w:eastAsia="Times New Roman"/>
-                <w:color w:val="000000"/>
-                <w:sz w:val="20"/>
-                <w:szCs w:val="20"/>
-              </w:rPr>
-              <w:t xml:space="preserve">; Present ideas for final project </w:t>
+              <w:t xml:space="preserve">Workshop: Plotly; Present ideas for final project </w:t>
             </w:r>
           </w:p>
         </w:tc>
@@ -4283,39 +4181,8 @@
                 <w:sz w:val="20"/>
                 <w:szCs w:val="20"/>
               </w:rPr>
-              <w:t xml:space="preserve">Workshop: </w:t>
-            </w:r>
-            <w:proofErr w:type="spellStart"/>
-            <w:r>
-              <w:rPr>
-                <w:rFonts w:eastAsia="Times New Roman"/>
-                <w:color w:val="000000"/>
-                <w:sz w:val="20"/>
-                <w:szCs w:val="20"/>
-              </w:rPr>
-              <w:t>Plotly</w:t>
-            </w:r>
-            <w:proofErr w:type="spellEnd"/>
-            <w:r>
-              <w:rPr>
-                <w:rFonts w:eastAsia="Times New Roman"/>
-                <w:color w:val="000000"/>
-                <w:sz w:val="20"/>
-                <w:szCs w:val="20"/>
-              </w:rPr>
-              <w:t xml:space="preserve">, </w:t>
-            </w:r>
-            <w:proofErr w:type="spellStart"/>
-            <w:r>
-              <w:rPr>
-                <w:rFonts w:eastAsia="Times New Roman"/>
-                <w:color w:val="000000"/>
-                <w:sz w:val="20"/>
-                <w:szCs w:val="20"/>
-              </w:rPr>
-              <w:t>geopandas</w:t>
-            </w:r>
-            <w:proofErr w:type="spellEnd"/>
+              <w:t>Workshop: Plotly, geopandas</w:t>
+            </w:r>
           </w:p>
         </w:tc>
         <w:tc>
@@ -4478,27 +4345,7 @@
                 <w:szCs w:val="20"/>
               </w:rPr>
               <w:lastRenderedPageBreak/>
-              <w:t xml:space="preserve">Workshop: Visualizing networks in </w:t>
-            </w:r>
-            <w:proofErr w:type="spellStart"/>
-            <w:r>
-              <w:rPr>
-                <w:rFonts w:eastAsia="Times New Roman"/>
-                <w:color w:val="000000"/>
-                <w:sz w:val="20"/>
-                <w:szCs w:val="20"/>
-              </w:rPr>
-              <w:t>Networkx</w:t>
-            </w:r>
-            <w:proofErr w:type="spellEnd"/>
-            <w:r>
-              <w:rPr>
-                <w:rFonts w:eastAsia="Times New Roman"/>
-                <w:color w:val="000000"/>
-                <w:sz w:val="20"/>
-                <w:szCs w:val="20"/>
-              </w:rPr>
-              <w:t xml:space="preserve"> (python) and Gephi; Final project data sources.</w:t>
+              <w:t>Workshop: Visualizing networks in Networkx (python) and Gephi; Final project data sources.</w:t>
             </w:r>
           </w:p>
         </w:tc>
@@ -6002,15 +5849,7 @@
         </w:r>
       </w:hyperlink>
       <w:r>
-        <w:t xml:space="preserve"> section of </w:t>
-      </w:r>
-      <w:proofErr w:type="spellStart"/>
-      <w:r>
-        <w:t>OnePratt</w:t>
-      </w:r>
-      <w:proofErr w:type="spellEnd"/>
-      <w:r>
-        <w:t>.</w:t>
+        <w:t xml:space="preserve"> section of OnePratt.</w:t>
       </w:r>
     </w:p>
     <w:p>

</xml_diff>

<commit_message>
week 12 lecture start
</commit_message>
<xml_diff>
--- a/syllabus/syllabusSp26.docx
+++ b/syllabus/syllabusSp26.docx
@@ -2638,7 +2638,27 @@
                 <w:sz w:val="20"/>
                 <w:szCs w:val="20"/>
               </w:rPr>
-              <w:t>orkshop: Datawrapper pt. 1</w:t>
+              <w:t xml:space="preserve">orkshop: </w:t>
+            </w:r>
+            <w:proofErr w:type="spellStart"/>
+            <w:r>
+              <w:rPr>
+                <w:rFonts w:eastAsia="Times New Roman"/>
+                <w:color w:val="000000"/>
+                <w:sz w:val="20"/>
+                <w:szCs w:val="20"/>
+              </w:rPr>
+              <w:t>Datawrapper</w:t>
+            </w:r>
+            <w:proofErr w:type="spellEnd"/>
+            <w:r>
+              <w:rPr>
+                <w:rFonts w:eastAsia="Times New Roman"/>
+                <w:color w:val="000000"/>
+                <w:sz w:val="20"/>
+                <w:szCs w:val="20"/>
+              </w:rPr>
+              <w:t xml:space="preserve"> pt. 1</w:t>
             </w:r>
           </w:p>
         </w:tc>
@@ -2893,7 +2913,27 @@
                 <w:sz w:val="20"/>
                 <w:szCs w:val="20"/>
               </w:rPr>
-              <w:t>Workshop: Datawrapper pt 2</w:t>
+              <w:t xml:space="preserve">Workshop: </w:t>
+            </w:r>
+            <w:proofErr w:type="spellStart"/>
+            <w:r>
+              <w:rPr>
+                <w:rFonts w:eastAsia="Times New Roman"/>
+                <w:color w:val="000000"/>
+                <w:sz w:val="20"/>
+                <w:szCs w:val="20"/>
+              </w:rPr>
+              <w:t>Datawrapper</w:t>
+            </w:r>
+            <w:proofErr w:type="spellEnd"/>
+            <w:r>
+              <w:rPr>
+                <w:rFonts w:eastAsia="Times New Roman"/>
+                <w:color w:val="000000"/>
+                <w:sz w:val="20"/>
+                <w:szCs w:val="20"/>
+              </w:rPr>
+              <w:t xml:space="preserve"> pt 2</w:t>
             </w:r>
           </w:p>
         </w:tc>
@@ -3108,8 +3148,19 @@
                 <w:sz w:val="20"/>
                 <w:szCs w:val="20"/>
               </w:rPr>
-              <w:t>Workshop: Tech check – Google Colab</w:t>
-            </w:r>
+              <w:t xml:space="preserve">Workshop: Tech check – Google </w:t>
+            </w:r>
+            <w:proofErr w:type="spellStart"/>
+            <w:r>
+              <w:rPr>
+                <w:rFonts w:eastAsia="Times New Roman"/>
+                <w:color w:val="000000"/>
+                <w:sz w:val="20"/>
+                <w:szCs w:val="20"/>
+              </w:rPr>
+              <w:t>Colab</w:t>
+            </w:r>
+            <w:proofErr w:type="spellEnd"/>
           </w:p>
         </w:tc>
         <w:tc>
@@ -3675,8 +3726,39 @@
                 <w:sz w:val="20"/>
                 <w:szCs w:val="20"/>
               </w:rPr>
-              <w:t>Workshop: Seaborn, MatplotLib, Scipy</w:t>
-            </w:r>
+              <w:t xml:space="preserve">Workshop: Seaborn, </w:t>
+            </w:r>
+            <w:proofErr w:type="spellStart"/>
+            <w:r>
+              <w:rPr>
+                <w:rFonts w:eastAsia="Times New Roman"/>
+                <w:color w:val="000000"/>
+                <w:sz w:val="20"/>
+                <w:szCs w:val="20"/>
+              </w:rPr>
+              <w:t>MatplotLib</w:t>
+            </w:r>
+            <w:proofErr w:type="spellEnd"/>
+            <w:r>
+              <w:rPr>
+                <w:rFonts w:eastAsia="Times New Roman"/>
+                <w:color w:val="000000"/>
+                <w:sz w:val="20"/>
+                <w:szCs w:val="20"/>
+              </w:rPr>
+              <w:t xml:space="preserve">, </w:t>
+            </w:r>
+            <w:proofErr w:type="spellStart"/>
+            <w:r>
+              <w:rPr>
+                <w:rFonts w:eastAsia="Times New Roman"/>
+                <w:color w:val="000000"/>
+                <w:sz w:val="20"/>
+                <w:szCs w:val="20"/>
+              </w:rPr>
+              <w:t>Scipy</w:t>
+            </w:r>
+            <w:proofErr w:type="spellEnd"/>
           </w:p>
         </w:tc>
         <w:tc>
@@ -4181,8 +4263,19 @@
                 <w:sz w:val="20"/>
                 <w:szCs w:val="20"/>
               </w:rPr>
-              <w:t>Workshop: Plotly, geopandas</w:t>
-            </w:r>
+              <w:t xml:space="preserve">Workshop: Plotly, </w:t>
+            </w:r>
+            <w:proofErr w:type="spellStart"/>
+            <w:r>
+              <w:rPr>
+                <w:rFonts w:eastAsia="Times New Roman"/>
+                <w:color w:val="000000"/>
+                <w:sz w:val="20"/>
+                <w:szCs w:val="20"/>
+              </w:rPr>
+              <w:t>geopandas</w:t>
+            </w:r>
+            <w:proofErr w:type="spellEnd"/>
           </w:p>
         </w:tc>
         <w:tc>
@@ -4226,6 +4319,59 @@
               </w:rPr>
               <w:t>Ch 15</w:t>
             </w:r>
+          </w:p>
+          <w:p>
+            <w:pPr>
+              <w:spacing w:line="240" w:lineRule="auto"/>
+              <w:contextualSpacing/>
+              <w:rPr>
+                <w:rFonts w:eastAsia="Times New Roman"/>
+                <w:sz w:val="20"/>
+                <w:szCs w:val="20"/>
+              </w:rPr>
+            </w:pPr>
+          </w:p>
+          <w:p>
+            <w:pPr>
+              <w:spacing w:line="240" w:lineRule="auto"/>
+              <w:contextualSpacing/>
+              <w:rPr>
+                <w:rFonts w:eastAsia="Times New Roman"/>
+                <w:sz w:val="20"/>
+                <w:szCs w:val="20"/>
+              </w:rPr>
+            </w:pPr>
+            <w:hyperlink r:id="rId16" w:history="1">
+              <w:r>
+                <w:rPr>
+                  <w:rStyle w:val="Hyperlink"/>
+                  <w:rFonts w:eastAsia="Times New Roman"/>
+                  <w:sz w:val="20"/>
+                  <w:szCs w:val="20"/>
+                </w:rPr>
+                <w:t>Towards a Better Way: The “</w:t>
+              </w:r>
+              <w:proofErr w:type="spellStart"/>
+              <w:r>
+                <w:rPr>
+                  <w:rStyle w:val="Hyperlink"/>
+                  <w:rFonts w:eastAsia="Times New Roman"/>
+                  <w:sz w:val="20"/>
+                  <w:szCs w:val="20"/>
+                </w:rPr>
+                <w:t>Vignelli</w:t>
+              </w:r>
+              <w:proofErr w:type="spellEnd"/>
+              <w:r>
+                <w:rPr>
+                  <w:rStyle w:val="Hyperlink"/>
+                  <w:rFonts w:eastAsia="Times New Roman"/>
+                  <w:sz w:val="20"/>
+                  <w:szCs w:val="20"/>
+                </w:rPr>
+                <w:t>” Map at 50</w:t>
+              </w:r>
+            </w:hyperlink>
           </w:p>
         </w:tc>
       </w:tr>
@@ -4345,7 +4491,27 @@
                 <w:szCs w:val="20"/>
               </w:rPr>
               <w:lastRenderedPageBreak/>
-              <w:t>Workshop: Visualizing networks in Networkx (python) and Gephi; Final project data sources.</w:t>
+              <w:t xml:space="preserve">Workshop: Visualizing networks in </w:t>
+            </w:r>
+            <w:proofErr w:type="spellStart"/>
+            <w:r>
+              <w:rPr>
+                <w:rFonts w:eastAsia="Times New Roman"/>
+                <w:color w:val="000000"/>
+                <w:sz w:val="20"/>
+                <w:szCs w:val="20"/>
+              </w:rPr>
+              <w:t>Networkx</w:t>
+            </w:r>
+            <w:proofErr w:type="spellEnd"/>
+            <w:r>
+              <w:rPr>
+                <w:rFonts w:eastAsia="Times New Roman"/>
+                <w:color w:val="000000"/>
+                <w:sz w:val="20"/>
+                <w:szCs w:val="20"/>
+              </w:rPr>
+              <w:t xml:space="preserve"> (python) and Gephi; Final project data sources.</w:t>
             </w:r>
           </w:p>
         </w:tc>
@@ -4948,7 +5114,7 @@
       <w:r>
         <w:t xml:space="preserve">The following abbreviated set of policies is especially relevant to this class. Full details on policies and procedures can be found on the Pratt </w:t>
       </w:r>
-      <w:hyperlink r:id="rId16">
+      <w:hyperlink r:id="rId17">
         <w:r>
           <w:rPr>
             <w:color w:val="1155CC"/>
@@ -4978,7 +5144,7 @@
       <w:r>
         <w:t xml:space="preserve">All Pratt students, faculty, and staff members are expected to value and uphold the </w:t>
       </w:r>
-      <w:hyperlink r:id="rId17">
+      <w:hyperlink r:id="rId18">
         <w:r>
           <w:rPr>
             <w:color w:val="1155CC"/>
@@ -5236,7 +5402,7 @@
       <w:r>
         <w:t xml:space="preserve">The use of generative artificial intelligence (AI) to produce or to improve work, whether visual or textual, except when called for by an assignment or instructor and acknowledged transparently as one tool among others in the creative process. (See also Pratt’s </w:t>
       </w:r>
-      <w:hyperlink r:id="rId18">
+      <w:hyperlink r:id="rId19">
         <w:r>
           <w:rPr>
             <w:color w:val="1155CC"/>
@@ -5274,7 +5440,7 @@
       <w:r>
         <w:t xml:space="preserve">The Academic Integrity Standing Committee (AISC) is charged with educating faculty, staff, and students about academic integrity practices. Whenever possible, we strive to resolve alleged infractions at the most local level possible, such as between student and professor, or within a department or school. When necessary, members of this committee will form an Academic Integrity Hearing Board to hear cases regarding cheating, plagiarism, and other infractions described below; these infractions can be grounds for citation, sanction, or dismissal. Detailed procedures are explained in the full version of the </w:t>
       </w:r>
-      <w:hyperlink r:id="rId19">
+      <w:hyperlink r:id="rId20">
         <w:r>
           <w:rPr>
             <w:color w:val="1155CC"/>
@@ -5283,7 +5449,7 @@
           <w:t xml:space="preserve">Academic Integrity </w:t>
         </w:r>
       </w:hyperlink>
-      <w:hyperlink r:id="rId20">
+      <w:hyperlink r:id="rId21">
         <w:r>
           <w:rPr>
             <w:color w:val="1155CC"/>
@@ -5330,7 +5496,7 @@
       <w:r>
         <w:t xml:space="preserve">Consistent attendance is essential for the completion of any course or program and is a precondition for passing a course. Attendance alone cannot count as a specific portion of a student’s grade, though class participation may be counted as part of a student’s grade. A student’s final grade may be lowered as a result of absences, at the discretion of the instructor and as specified on their syllabus. Repeated absences may result in a failing grade. For full details, see Pratt’s </w:t>
       </w:r>
-      <w:hyperlink r:id="rId21">
+      <w:hyperlink r:id="rId22">
         <w:r>
           <w:rPr>
             <w:color w:val="1155CC"/>
@@ -5358,7 +5524,7 @@
       <w:r>
         <w:t xml:space="preserve">Students with extensive absences (three or more for any reason) may be required to drop the course or may receive a failing grade at the discretion of the instructor. For more information on Pratt’s Attendance Policy, please visit </w:t>
       </w:r>
-      <w:hyperlink r:id="rId22">
+      <w:hyperlink r:id="rId23">
         <w:r>
           <w:rPr>
             <w:color w:val="1155CC"/>
@@ -5403,7 +5569,7 @@
         <w:lastRenderedPageBreak/>
         <w:t xml:space="preserve">contact the Student Success Center at </w:t>
       </w:r>
-      <w:hyperlink r:id="rId23">
+      <w:hyperlink r:id="rId24">
         <w:r>
           <w:rPr>
             <w:color w:val="1155CC"/>
@@ -5429,7 +5595,7 @@
       <w:r>
         <w:t xml:space="preserve">For assistance with writing assignments, contact the Writing and Tutorial Center at </w:t>
       </w:r>
-      <w:hyperlink r:id="rId24">
+      <w:hyperlink r:id="rId25">
         <w:r>
           <w:rPr>
             <w:color w:val="1155CC"/>
@@ -5441,7 +5607,7 @@
       <w:r>
         <w:t xml:space="preserve">. The </w:t>
       </w:r>
-      <w:hyperlink r:id="rId25">
+      <w:hyperlink r:id="rId26">
         <w:r>
           <w:rPr>
             <w:color w:val="1155CC"/>
@@ -5467,7 +5633,7 @@
       <w:r>
         <w:t xml:space="preserve">Academic advisors are also a great resource; students can find their advisor’s contact information or schedule an appointment through </w:t>
       </w:r>
-      <w:hyperlink r:id="rId26">
+      <w:hyperlink r:id="rId27">
         <w:r>
           <w:rPr>
             <w:color w:val="1155CC"/>
@@ -5504,7 +5670,7 @@
         </w:rPr>
         <w:t xml:space="preserve">The </w:t>
       </w:r>
-      <w:hyperlink r:id="rId27">
+      <w:hyperlink r:id="rId28">
         <w:r>
           <w:rPr>
             <w:color w:val="1155CC"/>
@@ -5519,7 +5685,7 @@
         </w:rPr>
         <w:t xml:space="preserve"> coordinates access for students with disabilities. Students who identify as having any type of disability are entitled and encouraged to enroll with the L/AC in order to determine and implement reasonable accommodations. Contact the Learning/Access Center at </w:t>
       </w:r>
-      <w:hyperlink r:id="rId28">
+      <w:hyperlink r:id="rId29">
         <w:r>
           <w:rPr>
             <w:color w:val="1155CC"/>
@@ -5550,7 +5716,7 @@
       <w:r>
         <w:t xml:space="preserve">Pratt Institute is committed to fostering a safe and welcoming learning environment. The Institute’s </w:t>
       </w:r>
-      <w:hyperlink r:id="rId29">
+      <w:hyperlink r:id="rId30">
         <w:r>
           <w:rPr>
             <w:color w:val="1155CC"/>
@@ -5562,7 +5728,7 @@
       <w:r>
         <w:t xml:space="preserve"> prohibits unlawful discrimination and harassment, and sexual misconduct including sex discrimination, sex-based harassment, sexual assault, dating/domestic violence, and stalking. The Institute takes prompt and appropriate action to address prohibited conduct, end a hostile environment if one has been created, and prevent the recurrence of a hostile environment. To submit a concern of prohibited conduct, please use the </w:t>
       </w:r>
-      <w:hyperlink r:id="rId30">
+      <w:hyperlink r:id="rId31">
         <w:r>
           <w:rPr>
             <w:color w:val="1155CC"/>
@@ -5574,7 +5740,7 @@
       <w:r>
         <w:t xml:space="preserve">. Title IX also covers accommodations for pregnancy and related conditions and/or parental status. Should you require a reasonable accommodation because of such status, please contact the </w:t>
       </w:r>
-      <w:hyperlink r:id="rId31">
+      <w:hyperlink r:id="rId32">
         <w:r>
           <w:rPr>
             <w:color w:val="1155CC"/>
@@ -5606,7 +5772,7 @@
       <w:r>
         <w:t xml:space="preserve">: The </w:t>
       </w:r>
-      <w:hyperlink r:id="rId32">
+      <w:hyperlink r:id="rId33">
         <w:r>
           <w:rPr>
             <w:color w:val="1155CC"/>
@@ -5618,7 +5784,7 @@
       <w:r>
         <w:t xml:space="preserve"> does require that I report any incident of discrimination, harassment, or sexual misconduct that you disclose to me to the Institute's </w:t>
       </w:r>
-      <w:hyperlink r:id="rId33">
+      <w:hyperlink r:id="rId34">
         <w:r>
           <w:rPr>
             <w:color w:val="1155CC"/>
@@ -5630,7 +5796,7 @@
       <w:r>
         <w:t xml:space="preserve"> If you do inform me of such conduct I will keep the information private. You are welcome to report an incident directly by contacting the Title IX Coordinator or using the </w:t>
       </w:r>
-      <w:hyperlink r:id="rId34">
+      <w:hyperlink r:id="rId35">
         <w:r>
           <w:rPr>
             <w:color w:val="1155CC"/>
@@ -5642,7 +5808,7 @@
       <w:r>
         <w:t xml:space="preserve">. You can also speak to someone confidentially by contacting our confidential resources in </w:t>
       </w:r>
-      <w:hyperlink r:id="rId35">
+      <w:hyperlink r:id="rId36">
         <w:r>
           <w:rPr>
             <w:color w:val="1155CC"/>
@@ -5654,7 +5820,7 @@
       <w:r>
         <w:t xml:space="preserve"> or the </w:t>
       </w:r>
-      <w:hyperlink r:id="rId36">
+      <w:hyperlink r:id="rId37">
         <w:r>
           <w:rPr>
             <w:color w:val="1155CC"/>
@@ -5673,7 +5839,7 @@
         </w:rPr>
         <w:t xml:space="preserve">For more information, please contact the </w:t>
       </w:r>
-      <w:hyperlink r:id="rId37">
+      <w:hyperlink r:id="rId38">
         <w:r>
           <w:rPr>
             <w:color w:val="1155CC"/>
@@ -5724,7 +5890,7 @@
       <w:r>
         <w:t xml:space="preserve">Pratt is dedicated to creating a culture where the entire community can flourish and thrive. Taking time to care for yourself and seeking appropriate support is important to achieving your academic and professional goals. Several resources are available through </w:t>
       </w:r>
-      <w:hyperlink r:id="rId38">
+      <w:hyperlink r:id="rId39">
         <w:r>
           <w:rPr>
             <w:color w:val="1155CC"/>
@@ -5736,7 +5902,7 @@
       <w:r>
         <w:t xml:space="preserve">, including our Student Advocate and Care Coordinator, who can also be reached at 718.399.4546 or </w:t>
       </w:r>
-      <w:hyperlink r:id="rId39">
+      <w:hyperlink r:id="rId40">
         <w:r>
           <w:rPr>
             <w:color w:val="1155CC"/>
@@ -5748,7 +5914,7 @@
       <w:r>
         <w:t xml:space="preserve">. If you or anyone you know experiences overwhelming academic stress, persistent difficult feelings, or challenging life events, the Counseling Center can be reached 24/7 by calling 718.687.5356. To schedule a consultation, please call or email </w:t>
       </w:r>
-      <w:hyperlink r:id="rId40">
+      <w:hyperlink r:id="rId41">
         <w:r>
           <w:rPr>
             <w:color w:val="1155CC"/>
@@ -5774,7 +5940,7 @@
         <w:spacing w:line="240" w:lineRule="auto"/>
         <w:ind w:right="366"/>
       </w:pPr>
-      <w:hyperlink r:id="rId41">
+      <w:hyperlink r:id="rId42">
         <w:r>
           <w:rPr>
             <w:color w:val="1155CC"/>
@@ -5815,7 +5981,7 @@
       <w:r>
         <w:t xml:space="preserve">The Department of Public Safety provides 24-hour-a-day protection to the campus, including an </w:t>
       </w:r>
-      <w:hyperlink r:id="rId42">
+      <w:hyperlink r:id="rId43">
         <w:r>
           <w:rPr>
             <w:color w:val="1155CC"/>
@@ -5827,7 +5993,7 @@
       <w:r>
         <w:t xml:space="preserve">. Contact Public Safety at </w:t>
       </w:r>
-      <w:hyperlink r:id="rId43">
+      <w:hyperlink r:id="rId44">
         <w:r>
           <w:rPr>
             <w:color w:val="1155CC"/>
@@ -5839,7 +6005,7 @@
       <w:r>
         <w:t xml:space="preserve"> or 718.636.3540. The Pratt Emergency Alert System is used to send urgent messages to registered mobile devices and emails (faculty, staff, and students have the option to opt-out, which must be renewed each year). You can update your emergency contact information in the </w:t>
       </w:r>
-      <w:hyperlink r:id="rId44">
+      <w:hyperlink r:id="rId45">
         <w:r>
           <w:rPr>
             <w:color w:val="1155CC"/>
@@ -5849,7 +6015,15 @@
         </w:r>
       </w:hyperlink>
       <w:r>
-        <w:t xml:space="preserve"> section of OnePratt.</w:t>
+        <w:t xml:space="preserve"> section of </w:t>
+      </w:r>
+      <w:proofErr w:type="spellStart"/>
+      <w:r>
+        <w:t>OnePratt</w:t>
+      </w:r>
+      <w:proofErr w:type="spellEnd"/>
+      <w:r>
+        <w:t>.</w:t>
       </w:r>
     </w:p>
     <w:p>
@@ -5870,7 +6044,7 @@
       </w:pPr>
     </w:p>
     <w:sectPr>
-      <w:footerReference w:type="default" r:id="rId45"/>
+      <w:footerReference w:type="default" r:id="rId46"/>
       <w:pgSz w:w="12240" w:h="15840"/>
       <w:pgMar w:top="1440" w:right="1440" w:bottom="1440" w:left="1440" w:header="720" w:footer="720" w:gutter="0"/>
       <w:cols w:space="720"/>

</xml_diff>